<commit_message>
Update competition doc: accurate XZ AI + nutrition recommender section based on source code
</commit_message>
<xml_diff>
--- a/docs/参赛文档_软件系统介绍_v1.docx
+++ b/docs/参赛文档_软件系统介绍_v1.docx
@@ -1332,7 +1332,7 @@
         <w:rPr>
           <w:rFonts w:ascii="黑体" w:hAnsi="黑体" w:eastAsia="黑体"/>
         </w:rPr>
-        <w:t>2.3.5 小智 AI 语音交互</w:t>
+        <w:t>2.3.5 小智 AI 智能交互</w:t>
       </w:r>
     </w:p>
     <w:p>
@@ -1344,13 +1344,13 @@
           <w:rFonts w:ascii="宋体" w:hAnsi="宋体" w:eastAsia="宋体"/>
           <w:b/>
         </w:rPr>
-        <w:t>通信流程：</w:t>
+        <w:t>系统概述：</w:t>
       </w:r>
       <w:r>
         <w:rPr>
           <w:rFonts w:ascii="宋体" w:hAnsi="宋体" w:eastAsia="宋体"/>
         </w:rPr>
-        <w:t>用户通过微信小程序以文字或语音方式与小智 AI 服务端交互。服务端调用 DeepSeek 大语言模型结合营养推荐引擎解析用户意图，通过 MCP 协议下发结构化控制指令至 ESP32。设备端通过 WebSocket 长连接接收指令并执行，执行结果经服务端 TTS 合成语音后在小程序或设备端播报。</w:t>
+        <w:t>系统通过微信小程序作为用户入口，集成小智 AI 服务端（xiaozhi-server）实现智能饮食推荐与设备控制。用户在小程序聊天界面中描述当日饮食情况和晚餐面食需求，服务端基于 FastAPI 框架的营养推荐引擎（nutrition-service）解析饮食文本，结合规则引擎与大语言模型识别食物类别、估算摄入量，并根据当日精制主食和杂粮摄入情况，通过推荐算法计算晚餐面团中的杂粮粉配比。推荐结果经用户确认后，服务端通过 WebSocket 长连接以 MCP 协议下发结构化控制指令至 ESP32 设备端，驱动和面机完成全自动制作流程。</w:t>
       </w:r>
     </w:p>
     <w:tbl>
@@ -1380,7 +1380,24 @@
                 <w:b/>
                 <w:sz w:val="20"/>
               </w:rPr>
-              <w:t>用户输入</w:t>
+              <w:t>阶段</w:t>
+            </w:r>
+          </w:p>
+        </w:tc>
+        <w:tc>
+          <w:tcPr>
+            <w:tcW w:type="dxa" w:w="2160"/>
+          </w:tcPr>
+          <w:p>
+            <w:pPr>
+              <w:jc w:val="center"/>
+            </w:pPr>
+            <w:r>
+              <w:rPr>
+                <w:b/>
+                <w:sz w:val="20"/>
+              </w:rPr>
+              <w:t>小程序/用户端</w:t>
             </w:r>
           </w:p>
         </w:tc>
@@ -1414,24 +1431,7 @@
                 <w:b/>
                 <w:sz w:val="20"/>
               </w:rPr>
-              <w:t>MCP 指令</w:t>
-            </w:r>
-          </w:p>
-        </w:tc>
-        <w:tc>
-          <w:tcPr>
-            <w:tcW w:type="dxa" w:w="2160"/>
-          </w:tcPr>
-          <w:p>
-            <w:pPr>
-              <w:jc w:val="center"/>
-            </w:pPr>
-            <w:r>
-              <w:rPr>
-                <w:b/>
-                <w:sz w:val="20"/>
-              </w:rPr>
-              <w:t>设备端执行</w:t>
+              <w:t>数据/接口</w:t>
             </w:r>
           </w:p>
         </w:tc>
@@ -1446,7 +1446,7 @@
               <w:rPr>
                 <w:sz w:val="20"/>
               </w:rPr>
-              <w:t>"开始和面 300g 饺子皮"</w:t>
+              <w:t>饮食输入</w:t>
             </w:r>
           </w:p>
         </w:tc>
@@ -1459,7 +1459,9 @@
               <w:rPr>
                 <w:sz w:val="20"/>
               </w:rPr>
-              <w:t>LLM 意图识别 + 营养推荐</w:t>
+              <w:t>用户文字描述当日饮食和面食需求</w:t>
+              <w:br/>
+              <w:t>例："中午牛肉面，晚上包300g饺子"</w:t>
             </w:r>
           </w:p>
         </w:tc>
@@ -1472,7 +1474,9 @@
               <w:rPr>
                 <w:sz w:val="20"/>
               </w:rPr>
-              <w:t>start_mixer {weight:300}</w:t>
+              <w:t>LLM 解析 + 规则引擎识别食物条目</w:t>
+              <w:br/>
+              <w:t>估算每项重量与类别（精制主食/杂粮/蛋白质等）</w:t>
             </w:r>
           </w:p>
         </w:tc>
@@ -1485,7 +1489,9 @@
               <w:rPr>
                 <w:sz w:val="20"/>
               </w:rPr>
-              <w:t>weight_work(300)</w:t>
+              <w:t>POST /api/v1/intake/parse</w:t>
+              <w:br/>
+              <w:t>→ ParseResult (FoodItem[] + DoughRequest)</w:t>
             </w:r>
           </w:p>
         </w:tc>
@@ -1500,7 +1506,7 @@
               <w:rPr>
                 <w:sz w:val="20"/>
               </w:rPr>
-              <w:t>"停止"</w:t>
+              <w:t>确认修正</w:t>
             </w:r>
           </w:p>
         </w:tc>
@@ -1513,7 +1519,9 @@
               <w:rPr>
                 <w:sz w:val="20"/>
               </w:rPr>
-              <w:t>LLM 意图识别</w:t>
+              <w:t>用户确认或修改解析出的饮食清单</w:t>
+              <w:br/>
+              <w:t>调整面团目标重量</w:t>
             </w:r>
           </w:p>
         </w:tc>
@@ -1526,7 +1534,9 @@
               <w:rPr>
                 <w:sz w:val="20"/>
               </w:rPr>
-              <w:t>stop_mixer</w:t>
+              <w:t>存储确认后的饮食记录至 SQLite</w:t>
+              <w:br/>
+              <w:t>加载用户画像（年龄组/食欲/消化敏感度）</w:t>
             </w:r>
           </w:p>
         </w:tc>
@@ -1539,7 +1549,9 @@
               <w:rPr>
                 <w:sz w:val="20"/>
               </w:rPr>
-              <w:t>fstop()</w:t>
+              <w:t>POST /api/v1/recommendations/coarse-grain</w:t>
+              <w:br/>
+              <w:t>→ Request (confirmed_items + dough_request)</w:t>
             </w:r>
           </w:p>
         </w:tc>
@@ -1554,7 +1566,7 @@
               <w:rPr>
                 <w:sz w:val="20"/>
               </w:rPr>
-              <w:t>"推出面团"</w:t>
+              <w:t>营养推荐</w:t>
             </w:r>
           </w:p>
         </w:tc>
@@ -1567,7 +1579,7 @@
               <w:rPr>
                 <w:sz w:val="20"/>
               </w:rPr>
-              <w:t>LLM 意图识别</w:t>
+              <w:t>查看推荐结果：杂粮粉克重、普通面粉克重、水量</w:t>
             </w:r>
           </w:p>
         </w:tc>
@@ -1580,7 +1592,9 @@
               <w:rPr>
                 <w:sz w:val="20"/>
               </w:rPr>
-              <w:t>push_out</w:t>
+              <w:t>推荐算法：根据当日精制主食摄入量（refined_weight）动态计算杂粮比例（10%~40%，步进5%）</w:t>
+              <w:br/>
+              <w:t>消化风险用户限制杂粮比例≤20%</w:t>
             </w:r>
           </w:p>
         </w:tc>
@@ -1593,13 +1607,91 @@
               <w:rPr>
                 <w:sz w:val="20"/>
               </w:rPr>
-              <w:t>push_and_out(1)</w:t>
+              <w:t>→ Recommendation</w:t>
+              <w:br/>
+              <w:t>(flour_weight_g, water_weight_g, coarse_grain_weight_g, ratio, reason)</w:t>
+            </w:r>
+          </w:p>
+        </w:tc>
+      </w:tr>
+      <w:tr>
+        <w:tc>
+          <w:tcPr>
+            <w:tcW w:type="dxa" w:w="2160"/>
+          </w:tcPr>
+          <w:p>
+            <w:r>
+              <w:rPr>
+                <w:sz w:val="20"/>
+              </w:rPr>
+              <w:t>执行和面</w:t>
+            </w:r>
+          </w:p>
+        </w:tc>
+        <w:tc>
+          <w:tcPr>
+            <w:tcW w:type="dxa" w:w="2160"/>
+          </w:tcPr>
+          <w:p>
+            <w:r>
+              <w:rPr>
+                <w:sz w:val="20"/>
+              </w:rPr>
+              <w:t>用户点击"开始和面"</w:t>
+            </w:r>
+          </w:p>
+        </w:tc>
+        <w:tc>
+          <w:tcPr>
+            <w:tcW w:type="dxa" w:w="2160"/>
+          </w:tcPr>
+          <w:p>
+            <w:r>
+              <w:rPr>
+                <w:sz w:val="20"/>
+              </w:rPr>
+              <w:t>服务端通过 WebSocket 下发 MCP 指令至 ESP32</w:t>
+              <w:br/>
+              <w:t>ESP32 执行 weight_work(weight)</w:t>
+            </w:r>
+          </w:p>
+        </w:tc>
+        <w:tc>
+          <w:tcPr>
+            <w:tcW w:type="dxa" w:w="2160"/>
+          </w:tcPr>
+          <w:p>
+            <w:r>
+              <w:rPr>
+                <w:sz w:val="20"/>
+              </w:rPr>
+              <w:t>MCP tool: start_mixer</w:t>
+              <w:br/>
+              <w:t>args: {weight: 300}</w:t>
             </w:r>
           </w:p>
         </w:tc>
       </w:tr>
     </w:tbl>
     <w:p/>
+    <w:p>
+      <w:pPr>
+        <w:spacing w:line="360" w:lineRule="auto" w:after="120"/>
+      </w:pPr>
+      <w:r>
+        <w:rPr>
+          <w:rFonts w:ascii="宋体" w:hAnsi="宋体" w:eastAsia="宋体"/>
+          <w:b/>
+        </w:rPr>
+        <w:t>推荐算法：</w:t>
+      </w:r>
+      <w:r>
+        <w:rPr>
+          <w:rFonts w:ascii="宋体" w:hAnsi="宋体" w:eastAsia="宋体"/>
+        </w:rPr>
+        <w:t>推荐算法的核心公式为：杂粮比例 = 基础 20% +（精制主食 ≥300g 则 +15% / ≥150g 则 +10%）-（已摄入杂粮 ≥100g 则 -5%），最终约束在 10%～40% 范围内并取 5% 整倍数。水量 = 面团总重 × 24%，面粉总量 = 面团总重 - 水量，杂粮粉重 = 面粉总量 × 杂粮比例。例如，用户当日已摄入约 300g 精制主食且无杂粮摄入时，推荐杂粮比例为 35%（20%+15%），300g 饺子的推荐结果为：普通面粉 148g、杂粮粉 80g、水 72g。</w:t>
+      </w:r>
+    </w:p>
     <w:p>
       <w:pPr>
         <w:spacing w:line="360" w:lineRule="auto" w:after="120"/>
@@ -1616,6 +1708,24 @@
           <w:rFonts w:ascii="宋体" w:hAnsi="宋体" w:eastAsia="宋体"/>
         </w:rPr>
         <w:t>I2S0 配置为全双工模式：BCLK（GPIO14）和 WS（GPIO16）由 INMP441 麦克风与 MAX98357A 扬声器功放共享，SD（GPIO17）接收麦克风数据，DIN（GPIO7）输出扬声器数据。全双工模式仅需 4 个 GPIO，相较于分离式接法节省 2 个引脚。音频采样率 16kHz，单声道，Opus 编码，帧长 60ms。唤醒词检测基于 ESP-SR MultiNet 引擎，关键词"你好小智"，检测后进入录音状态并通过 WebSocket 实时上传音频流。</w:t>
+      </w:r>
+    </w:p>
+    <w:p>
+      <w:pPr>
+        <w:spacing w:line="360" w:lineRule="auto" w:after="120"/>
+      </w:pPr>
+      <w:r>
+        <w:rPr>
+          <w:rFonts w:ascii="宋体" w:hAnsi="宋体" w:eastAsia="宋体"/>
+          <w:b/>
+        </w:rPr>
+        <w:t>架构设计原则：</w:t>
+      </w:r>
+      <w:r>
+        <w:rPr>
+          <w:rFonts w:ascii="宋体" w:hAnsi="宋体" w:eastAsia="宋体"/>
+        </w:rPr>
+        <w:t>微信小程序、小智 AI 服务端与 ESP32 设备端的三层架构将用户交互、智能决策和硬件执行分离：小程序承担展示、确认和任务发起的交互职责；服务端承担 NLP 解析、营养推荐计算和任务编排的算法职责；ESP32 承担实时电机控制和安全保护的执行职责。各层职责明确，边界清晰，便于后续独立升级任一模块。</w:t>
       </w:r>
     </w:p>
     <w:p>

</xml_diff>